<commit_message>
Summer End: code is live, and a time zone that will bite
SUMMEREND500 confirmed live in Shopify, expiring 11:59pm August 31. Placeholder
warning removed, 'midnight' replaced with 11:59pm throughout so the script, the
voicemail and the email all say the same thing the code does.

Added the time zone note. Shopify expires in the store's own zone, Arizona does
not observe daylight saving, so through August Arizona and Pacific are the same
moment while Eastern runs three hours ahead of both. An East Coast prospect
buying at 11pm their time on the 31st finds a dead code, and will read that as a
bait and switch rather than as a time zone. Two ways out, state the zone in the
copy or decide now to honor a near miss on September 1, and Millie needs to know
which before the first call rather than while someone is annoyed on the phone.

Co-Authored-By: Claude Opus 5 <noreply@anthropic.com>
</commit_message>
<xml_diff>
--- a/campaigns/summer-end-tired-test-outreach.docx
+++ b/campaigns/summer-end-tired-test-outreach.docx
@@ -74,17 +74,31 @@
         <w:t xml:space="preserve"> </w:t>
       </w:r>
       <w:r>
-        <w:t xml:space="preserve">$500 off the Consumer Unit and free shipping, through</w:t>
-      </w:r>
-      <w:r>
-        <w:t xml:space="preserve"> </w:t>
-      </w:r>
-      <w:r>
-        <w:rPr>
+        <w:t xml:space="preserve">$500 off the Consumer Unit and free shipping. Code</w:t>
+      </w:r>
+      <w:r>
+        <w:t xml:space="preserve"> </w:t>
+      </w:r>
+      <w:r>
+        <w:rPr>
+          <w:rStyle w:val="VerbatimChar"/>
           <w:b/>
           <w:bCs/>
         </w:rPr>
-        <w:t xml:space="preserve">midnight on Monday, August 31</w:t>
+        <w:t xml:space="preserve">SUMMEREND500</w:t>
+      </w:r>
+      <w:r>
+        <w:t xml:space="preserve">, live in Shopify, expires</w:t>
+      </w:r>
+      <w:r>
+        <w:t xml:space="preserve"> </w:t>
+      </w:r>
+      <w:r>
+        <w:rPr>
+          <w:b/>
+          <w:bCs/>
+        </w:rPr>
+        <w:t xml:space="preserve">11:59pm on Monday, August 31</w:t>
       </w:r>
       <w:r>
         <w:t xml:space="preserve">.</w:t>
@@ -131,13 +145,7 @@
           <w:b/>
           <w:bCs/>
         </w:rPr>
-        <w:t xml:space="preserve">1. The offer needs a working discount code.</w:t>
-      </w:r>
-      <w:r>
-        <w:t xml:space="preserve"> </w:t>
-      </w:r>
-      <w:r>
-        <w:t xml:space="preserve">Nothing here can go out until a Shopify code exists and has been tested on a real cart. Placeholder below is</w:t>
+        <w:t xml:space="preserve">1. The code is live.</w:t>
       </w:r>
       <w:r>
         <w:t xml:space="preserve"> </w:t>
@@ -149,7 +157,41 @@
         <w:t xml:space="preserve">SUMMEREND500</w:t>
       </w:r>
       <w:r>
-        <w:t xml:space="preserve">. Replace it everywhere or the first prospect who tries it does your QA for you.</w:t>
+        <w:t xml:space="preserve">, expiring 11:59pm on August 31. Run one test order to the cart step before the first call, so the first person to try it is not the one who finds a problem.</w:t>
+      </w:r>
+    </w:p>
+    <w:p>
+      <w:pPr>
+        <w:pStyle w:val="BodyText"/>
+      </w:pPr>
+      <w:r>
+        <w:rPr>
+          <w:b/>
+          <w:bCs/>
+        </w:rPr>
+        <w:t xml:space="preserve">Time zone, worth thirty seconds of thought.</w:t>
+      </w:r>
+      <w:r>
+        <w:t xml:space="preserve"> </w:t>
+      </w:r>
+      <w:r>
+        <w:t xml:space="preserve">Shopify expires the code in the store’s own zone. Arizona does not observe daylight saving, so through August,</w:t>
+      </w:r>
+      <w:r>
+        <w:t xml:space="preserve"> </w:t>
+      </w:r>
+      <w:r>
+        <w:rPr>
+          <w:b/>
+          <w:bCs/>
+        </w:rPr>
+        <w:t xml:space="preserve">Arizona time and Pacific time are the same moment.</w:t>
+      </w:r>
+      <w:r>
+        <w:t xml:space="preserve"> </w:t>
+      </w:r>
+      <w:r>
+        <w:t xml:space="preserve">Eastern is three hours ahead of both. A prospect on the East Coast who goes to buy at 11:00pm their time on the 31st will find the code already dead, and they will not read that as a time zone, they will read it as a bait and switch. Either say the zone in the copy, or decide now that you will honor a near miss on September 1 and tell Millie so she can say it on the phone.</w:t>
       </w:r>
     </w:p>
     <w:p>
@@ -399,7 +441,7 @@
         <w:pStyle w:val="BlockText"/>
       </w:pPr>
       <w:r>
-        <w:t xml:space="preserve">The reason for the timing. We are running a Summer End offer: $500 off and free shipping, through midnight on August 31. That takes it from $2,995 to $2,495. After the 31st it goes back.</w:t>
+        <w:t xml:space="preserve">The reason for the timing. We are running a Summer End offer: $500 off and free shipping, through 11:59pm on August 31. That takes it from $2,995 to $2,495. After the 31st it goes back.</w:t>
       </w:r>
     </w:p>
     <w:p>
@@ -806,7 +848,7 @@
         <w:pStyle w:val="BlockText"/>
       </w:pPr>
       <w:r>
-        <w:t xml:space="preserve">Hi {{first_name}}, this is Millie from Enyrgy. You took our Tired Test a while back. I’m calling because we’re running a Summer End offer that closes August 31, $500 off and free shipping, and I did not want you to miss it if you’d been thinking about it. I’ll send you an email with the details. If you’d rather talk it through, my number is here. Thanks.</w:t>
+        <w:t xml:space="preserve">Hi {{first_name}}, this is Millie from Enyrgy. You took our Tired Test a while back. I’m calling because we’re running a Summer End offer that closes 11:59pm on August 31, $500 off and free shipping, and I did not want you to miss it if you’d been thinking about it. I’ll send you an email with the details. If you’d rather talk it through, my number is here. Thanks.</w:t>
       </w:r>
     </w:p>
     <w:p>
@@ -908,7 +950,7 @@
         <w:rPr>
           <w:rStyle w:val="VerbatimChar"/>
         </w:rPr>
-        <w:t xml:space="preserve">Quick reason for writing. We are running a Summer End offer through midnight on August 31: $500 off the Enyrgy Vitamin D Primal Light Platform, and free shipping. That takes it to $2,495. After the 31st it goes back to $2,995.</w:t>
+        <w:t xml:space="preserve">Quick reason for writing. We are running a Summer End offer through 11:59pm on August 31: $500 off the Enyrgy Vitamin D Primal Light Platform, and free shipping. That takes it to $2,495. After the 31st it goes back to $2,995.</w:t>
       </w:r>
       <w:r>
         <w:br/>
@@ -1127,7 +1169,42 @@
               <w:pStyle w:val="Compact"/>
             </w:pPr>
             <w:r>
-              <w:t xml:space="preserve">First discount Enyrgy has run. Deadline is what protects the price.</w:t>
+              <w:t xml:space="preserve">First discount Enyrgy has run. Deadline is what protects the price. Code live in Shopify, expires 11:59pm Aug 31.</w:t>
+            </w:r>
+          </w:p>
+        </w:tc>
+      </w:tr>
+      <w:tr>
+        <w:tc>
+          <w:tcPr/>
+          <w:p>
+            <w:pPr>
+              <w:pStyle w:val="Compact"/>
+            </w:pPr>
+            <w:r>
+              <w:t xml:space="preserve">5</w:t>
+            </w:r>
+          </w:p>
+        </w:tc>
+        <w:tc>
+          <w:tcPr/>
+          <w:p>
+            <w:pPr>
+              <w:pStyle w:val="Compact"/>
+            </w:pPr>
+            <w:r>
+              <w:t xml:space="preserve">Time zone</w:t>
+            </w:r>
+          </w:p>
+        </w:tc>
+        <w:tc>
+          <w:tcPr/>
+          <w:p>
+            <w:pPr>
+              <w:pStyle w:val="Compact"/>
+            </w:pPr>
+            <w:r>
+              <w:t xml:space="preserve">Arizona equals Pacific through August, and Eastern is three hours ahead of both. Decide whether to state the zone or honor a near miss, before the first call.</w:t>
             </w:r>
           </w:p>
         </w:tc>

</xml_diff>